<commit_message>
Update five corrected senior proof documents
</commit_message>
<xml_diff>
--- a/files/senior-math/proofs/高中_冪級數收斂半徑證明.docx
+++ b/files/senior-math/proofs/高中_冪級數收斂半徑證明.docx
@@ -70,7 +70,16 @@
           <w:rFonts w:ascii="Microsoft JhengHei" w:hAnsi="Microsoft JhengHei" w:eastAsia="Microsoft JhengHei"/>
           <w:sz w:val="22"/>
         </w:rPr>
-        <w:t>令 R⁻¹=limsup |aₙ|¹⁄ⁿ。若 |x−c|&lt;R，選 q 介於 limsup |aₙ|¹⁄ⁿ·|x−c| 與 1 之間，充分大時 |aₙ(x−c)ⁿ|≤qⁿ，幾何比較得絕對收斂。若 |x−c|&gt;R，則項的 n 次方根下極限大於 1，項不趨零，故級數發散。根值判別的邊界等於 1 時不能下結論。</w:t>
+        <w:t>令 ρ=limsupₙ→∞∣aₙ∣¹⁄ⁿ，R=1／ρ，約定 1／0=∞、1／∞=0。若 ∣x−c∣&lt;R，項的 n 次方根上極限為 ρ∣x−c∣&lt;1；選其與 1 之間的 q，充分大時 ∣aₙ(x−c)ⁿ∣≤qⁿ，幾何比較得絕對收斂。</w:t>
+      </w:r>
+    </w:p>
+    <w:p>
+      <w:r>
+        <w:rPr>
+          <w:rFonts w:ascii="Microsoft JhengHei" w:hAnsi="Microsoft JhengHei" w:eastAsia="Microsoft JhengHei"/>
+          <w:sz w:val="22"/>
+        </w:rPr>
+        <w:t>若 ∣x−c∣&gt;R，則項的 n 次方根上極限大於 1。選 q&gt;1 小於該上極限，便有無窮多個 n 滿足 ∣aₙ(x−c)ⁿ∣&gt;qⁿ，故項不趨零，級數發散。此處需要的是上極限，而不保證下極限大於 1。x=c 時級數僅剩常數項。</w:t>
       </w:r>
     </w:p>
     <w:p>
@@ -101,18 +110,123 @@
           <m:num>
             <m:r>
               <m:rPr>
-                <m:sty m:val="p"/>
+                <m:nor m:val="1"/>
               </m:rPr>
+              <w:rPr>
+                <w:rFonts w:ascii="Cambria Math" w:hAnsi="Cambria Math"/>
+              </w:rPr>
               <m:t>1</m:t>
             </m:r>
           </m:num>
           <m:den>
+            <m:limLow>
+              <m:e>
+                <m:r>
+                  <m:rPr>
+                    <m:nor m:val="1"/>
+                  </m:rPr>
+                  <w:rPr>
+                    <w:rFonts w:ascii="Cambria Math" w:hAnsi="Cambria Math"/>
+                  </w:rPr>
+                  <m:t>limsup</m:t>
+                </m:r>
+              </m:e>
+              <m:lim>
+                <m:r>
+                  <m:rPr/>
+                  <w:rPr>
+                    <w:rFonts w:ascii="Cambria Math" w:hAnsi="Cambria Math"/>
+                  </w:rPr>
+                  <m:t>n</m:t>
+                </m:r>
+                <m:r>
+                  <m:rPr>
+                    <m:nor m:val="1"/>
+                  </m:rPr>
+                  <w:rPr>
+                    <w:rFonts w:ascii="Cambria Math" w:hAnsi="Cambria Math"/>
+                  </w:rPr>
+                  <m:t>→</m:t>
+                </m:r>
+                <m:r>
+                  <m:rPr>
+                    <m:nor m:val="1"/>
+                  </m:rPr>
+                  <w:rPr>
+                    <w:rFonts w:ascii="Cambria Math" w:hAnsi="Cambria Math"/>
+                  </w:rPr>
+                  <m:t>∞</m:t>
+                </m:r>
+              </m:lim>
+            </m:limLow>
             <m:r>
               <m:rPr>
-                <m:sty m:val="p"/>
+                <m:nor m:val="1"/>
               </m:rPr>
-              <m:t>limsupₙ→∞ |aₙ|¹⁄ⁿ</m:t>
+              <w:rPr>
+                <w:rFonts w:ascii="Cambria Math" w:hAnsi="Cambria Math"/>
+              </w:rPr>
+              <m:t> </m:t>
             </m:r>
+            <m:sSup>
+              <m:e>
+                <m:d>
+                  <m:dPr>
+                    <m:begChr m:val="|"/>
+                    <m:endChr m:val="|"/>
+                  </m:dPr>
+                  <m:e>
+                    <m:sSub>
+                      <m:e>
+                        <m:r>
+                          <m:rPr/>
+                          <w:rPr>
+                            <w:rFonts w:ascii="Cambria Math" w:hAnsi="Cambria Math"/>
+                          </w:rPr>
+                          <m:t>a</m:t>
+                        </m:r>
+                      </m:e>
+                      <m:sub>
+                        <m:r>
+                          <m:rPr/>
+                          <w:rPr>
+                            <w:rFonts w:ascii="Cambria Math" w:hAnsi="Cambria Math"/>
+                          </w:rPr>
+                          <m:t>n</m:t>
+                        </m:r>
+                      </m:sub>
+                    </m:sSub>
+                  </m:e>
+                </m:d>
+              </m:e>
+              <m:sup>
+                <m:f>
+                  <m:fPr>
+                    <m:type m:val="bar"/>
+                  </m:fPr>
+                  <m:num>
+                    <m:r>
+                      <m:rPr>
+                        <m:nor m:val="1"/>
+                      </m:rPr>
+                      <w:rPr>
+                        <w:rFonts w:ascii="Cambria Math" w:hAnsi="Cambria Math"/>
+                      </w:rPr>
+                      <m:t>1</m:t>
+                    </m:r>
+                  </m:num>
+                  <m:den>
+                    <m:r>
+                      <m:rPr/>
+                      <w:rPr>
+                        <w:rFonts w:ascii="Cambria Math" w:hAnsi="Cambria Math"/>
+                      </w:rPr>
+                      <m:t>n</m:t>
+                    </m:r>
+                  </m:den>
+                </m:f>
+              </m:sup>
+            </m:sSup>
           </m:den>
         </m:f>
       </m:oMath>
@@ -134,7 +248,133 @@
           <w:rFonts w:ascii="Microsoft JhengHei" w:hAnsi="Microsoft JhengHei" w:eastAsia="Microsoft JhengHei"/>
           <w:sz w:val="22"/>
         </w:rPr>
-        <w:t>若極限 {{|aₙ₊₁|aₙ}} 存在，亦有 R=lim {{|aₙ|aₙ₊₁}}。</w:t>
+        <w:t>若 aₙ 最終非零且 ℓ=limₙ→∞</w:t>
+      </w:r>
+      <m:oMath>
+        <m:f>
+          <m:fPr>
+            <m:type m:val="bar"/>
+          </m:fPr>
+          <m:num>
+            <m:d>
+              <m:dPr>
+                <m:begChr m:val="|"/>
+                <m:endChr m:val="|"/>
+              </m:dPr>
+              <m:e>
+                <m:sSub>
+                  <m:e>
+                    <m:r>
+                      <m:rPr/>
+                      <w:rPr>
+                        <w:rFonts w:ascii="Cambria Math" w:hAnsi="Cambria Math"/>
+                      </w:rPr>
+                      <m:t>a</m:t>
+                    </m:r>
+                  </m:e>
+                  <m:sub>
+                    <m:r>
+                      <m:rPr/>
+                      <w:rPr>
+                        <w:rFonts w:ascii="Cambria Math" w:hAnsi="Cambria Math"/>
+                      </w:rPr>
+                      <m:t>n</m:t>
+                    </m:r>
+                    <m:r>
+                      <m:rPr>
+                        <m:nor m:val="1"/>
+                      </m:rPr>
+                      <w:rPr>
+                        <w:rFonts w:ascii="Cambria Math" w:hAnsi="Cambria Math"/>
+                      </w:rPr>
+                      <m:t>+</m:t>
+                    </m:r>
+                    <m:r>
+                      <m:rPr>
+                        <m:nor m:val="1"/>
+                      </m:rPr>
+                      <w:rPr>
+                        <w:rFonts w:ascii="Cambria Math" w:hAnsi="Cambria Math"/>
+                      </w:rPr>
+                      <m:t>1</m:t>
+                    </m:r>
+                  </m:sub>
+                </m:sSub>
+              </m:e>
+            </m:d>
+          </m:num>
+          <m:den>
+            <m:d>
+              <m:dPr>
+                <m:begChr m:val="|"/>
+                <m:endChr m:val="|"/>
+              </m:dPr>
+              <m:e>
+                <m:sSub>
+                  <m:e>
+                    <m:r>
+                      <m:rPr/>
+                      <w:rPr>
+                        <w:rFonts w:ascii="Cambria Math" w:hAnsi="Cambria Math"/>
+                      </w:rPr>
+                      <m:t>a</m:t>
+                    </m:r>
+                  </m:e>
+                  <m:sub>
+                    <m:r>
+                      <m:rPr/>
+                      <w:rPr>
+                        <w:rFonts w:ascii="Cambria Math" w:hAnsi="Cambria Math"/>
+                      </w:rPr>
+                      <m:t>n</m:t>
+                    </m:r>
+                  </m:sub>
+                </m:sSub>
+              </m:e>
+            </m:d>
+          </m:den>
+        </m:f>
+      </m:oMath>
+      <w:r>
+        <w:rPr>
+          <w:rFonts w:ascii="Microsoft JhengHei" w:hAnsi="Microsoft JhengHei" w:eastAsia="Microsoft JhengHei"/>
+          <w:sz w:val="22"/>
+        </w:rPr>
+        <w:t xml:space="preserve"> 存在，則 R=</w:t>
+      </w:r>
+      <m:oMath>
+        <m:f>
+          <m:fPr>
+            <m:type m:val="bar"/>
+          </m:fPr>
+          <m:num>
+            <m:r>
+              <m:rPr>
+                <m:nor m:val="1"/>
+              </m:rPr>
+              <w:rPr>
+                <w:rFonts w:ascii="Cambria Math" w:hAnsi="Cambria Math"/>
+              </w:rPr>
+              <m:t>1</m:t>
+            </m:r>
+          </m:num>
+          <m:den>
+            <m:r>
+              <m:rPr/>
+              <w:rPr>
+                <w:rFonts w:ascii="Cambria Math" w:hAnsi="Cambria Math"/>
+              </w:rPr>
+              <m:t>ℓ</m:t>
+            </m:r>
+          </m:den>
+        </m:f>
+      </m:oMath>
+      <w:r>
+        <w:rPr>
+          <w:rFonts w:ascii="Microsoft JhengHei" w:hAnsi="Microsoft JhengHei" w:eastAsia="Microsoft JhengHei"/>
+          <w:sz w:val="22"/>
+        </w:rPr>
+        <w:t>。</w:t>
       </w:r>
     </w:p>
     <w:p>

</xml_diff>